<commit_message>
Database + Project Handbook
</commit_message>
<xml_diff>
--- a/Dokumentation/Protokoll.docx
+++ b/Dokumentation/Protokoll.docx
@@ -69,7 +69,7 @@
       </w:r>
       <w:r>
         <w:rPr/>
-        <w:t>9. Februar 2026</w:t>
+        <w:t>9. März 2026</w:t>
       </w:r>
       <w:r>
         <w:rPr/>
@@ -93,7 +93,7 @@
       <w:r>
         <w:rPr/>
         <w:drawing>
-          <wp:anchor behindDoc="0" distT="0" distB="0" distL="0" distR="0" simplePos="0" locked="0" layoutInCell="0" allowOverlap="1" relativeHeight="2">
+          <wp:anchor distT="0" distB="0" distL="0" distR="0" simplePos="0" relativeHeight="2" behindDoc="0" locked="0" layoutInCell="0" allowOverlap="1">
             <wp:simplePos x="0" y="0"/>
             <wp:positionH relativeFrom="margin">
               <wp:align>center</wp:align>
@@ -178,6 +178,8 @@
         <w:p>
           <w:pPr>
             <w:pStyle w:val="TOCHeading"/>
+            <w:spacing w:before="0" w:after="0"/>
+            <w:ind w:hanging="0" w:start="0"/>
             <w:rPr/>
           </w:pPr>
           <w:r>
@@ -212,16 +214,17 @@
             </w:rPr>
             <w:fldChar w:fldCharType="separate"/>
           </w:r>
-          <w:hyperlink w:anchor="__RefHeading___Toc506_346844924" w:tooltip="Hardware">
-            <w:r>
-              <w:rPr>
-                <w:rStyle w:val="IndexLink"/>
-              </w:rPr>
-              <w:t>Hardware</w:t>
-              <w:tab/>
-              <w:t>2</w:t>
-            </w:r>
-          </w:hyperlink>
+          <w:r>
+            <w:rPr>
+              <w:rStyle w:val="IndexLink"/>
+            </w:rPr>
+            <w:t>Hardware</w:t>
+          </w:r>
+          <w:r>
+            <w:rPr/>
+            <w:tab/>
+            <w:t>2</w:t>
+          </w:r>
         </w:p>
         <w:p>
           <w:pPr>
@@ -232,16 +235,12 @@
             </w:tabs>
             <w:rPr/>
           </w:pPr>
-          <w:hyperlink w:anchor="__RefHeading___Toc518_346844924" w:tooltip="Raspberry Pi Setup">
-            <w:r>
-              <w:rPr>
-                <w:rStyle w:val="IndexLink"/>
-              </w:rPr>
-              <w:t>Raspberry Pi Setup</w:t>
-              <w:tab/>
-              <w:t>2</w:t>
-            </w:r>
-          </w:hyperlink>
+          <w:r>
+            <w:rPr/>
+            <w:t>Raspberry Pi Setup</w:t>
+            <w:tab/>
+            <w:t>2</w:t>
+          </w:r>
         </w:p>
         <w:p>
           <w:pPr>
@@ -252,16 +251,12 @@
             </w:tabs>
             <w:rPr/>
           </w:pPr>
-          <w:hyperlink w:anchor="__RefHeading___Toc524_346844924" w:tooltip="Seriell mit dem Raspberry verbinden">
-            <w:r>
-              <w:rPr>
-                <w:rStyle w:val="IndexLink"/>
-              </w:rPr>
-              <w:t>Seriell mit dem Raspberry verbinden</w:t>
-              <w:tab/>
-              <w:t>2</w:t>
-            </w:r>
-          </w:hyperlink>
+          <w:r>
+            <w:rPr/>
+            <w:t>Seriell mit dem Raspberry verbinden</w:t>
+            <w:tab/>
+            <w:t>2</w:t>
+          </w:r>
         </w:p>
         <w:p>
           <w:pPr>
@@ -272,16 +267,12 @@
             </w:tabs>
             <w:rPr/>
           </w:pPr>
-          <w:hyperlink w:anchor="__RefHeading___Toc522_346844924" w:tooltip="WLAN-Konfiguration">
-            <w:r>
-              <w:rPr>
-                <w:rStyle w:val="IndexLink"/>
-              </w:rPr>
-              <w:t>WLAN-Konfiguration</w:t>
-              <w:tab/>
-              <w:t>3</w:t>
-            </w:r>
-          </w:hyperlink>
+          <w:r>
+            <w:rPr/>
+            <w:t>WLAN-Konfiguration</w:t>
+            <w:tab/>
+            <w:t>3</w:t>
+          </w:r>
         </w:p>
         <w:p>
           <w:pPr>
@@ -292,16 +283,12 @@
             </w:tabs>
             <w:rPr/>
           </w:pPr>
-          <w:hyperlink w:anchor="__RefHeading___Toc516_346844924" w:tooltip="Sensoren implementieren">
-            <w:r>
-              <w:rPr>
-                <w:rStyle w:val="IndexLink"/>
-              </w:rPr>
-              <w:t>Sensoren implementieren</w:t>
-              <w:tab/>
-              <w:t>4</w:t>
-            </w:r>
-          </w:hyperlink>
+          <w:r>
+            <w:rPr/>
+            <w:t>Sensoren implementieren</w:t>
+            <w:tab/>
+            <w:t>4</w:t>
+          </w:r>
         </w:p>
         <w:p>
           <w:pPr>
@@ -312,16 +299,12 @@
             </w:tabs>
             <w:rPr/>
           </w:pPr>
-          <w:hyperlink w:anchor="__RefHeading___Toc510_346844924" w:tooltip="Abbildungsverzeichnis">
-            <w:r>
-              <w:rPr>
-                <w:rStyle w:val="IndexLink"/>
-              </w:rPr>
-              <w:t>Abbildungsverzeichnis</w:t>
-              <w:tab/>
-              <w:t>6</w:t>
-            </w:r>
-          </w:hyperlink>
+          <w:r>
+            <w:rPr/>
+            <w:t>Abbildungsverzeichnis</w:t>
+            <w:tab/>
+            <w:t>6</w:t>
+          </w:r>
         </w:p>
         <w:p>
           <w:pPr>
@@ -332,20 +315,14 @@
             </w:tabs>
             <w:rPr/>
           </w:pPr>
-          <w:hyperlink w:anchor="__RefHeading___Toc508_346844924" w:tooltip="Literaturverzeichnis">
-            <w:r>
-              <w:rPr>
-                <w:rStyle w:val="IndexLink"/>
-              </w:rPr>
-              <w:t>Literaturverzeichnis</w:t>
-              <w:tab/>
-              <w:t>6</w:t>
-            </w:r>
-          </w:hyperlink>
           <w:r>
-            <w:rPr>
-              <w:rStyle w:val="IndexLink"/>
-            </w:rPr>
+            <w:rPr/>
+            <w:t>Literaturverzeichnis</w:t>
+            <w:tab/>
+            <w:t>6</w:t>
+          </w:r>
+          <w:r>
+            <w:rPr/>
             <w:fldChar w:fldCharType="end"/>
           </w:r>
         </w:p>
@@ -370,14 +347,16 @@
           <w:ilvl w:val="0"/>
           <w:numId w:val="1"/>
         </w:numPr>
+        <w:spacing w:before="0" w:after="80"/>
         <w:rPr/>
       </w:pPr>
       <w:bookmarkStart w:id="0" w:name="__RefHeading___Toc506_346844924"/>
       <w:bookmarkStart w:id="1" w:name="_Toc220924518"/>
       <w:bookmarkEnd w:id="0"/>
+      <w:bookmarkEnd w:id="1"/>
       <w:r>
         <w:drawing>
-          <wp:anchor behindDoc="0" distT="0" distB="0" distL="0" distR="0" simplePos="0" locked="0" layoutInCell="0" allowOverlap="1" relativeHeight="3">
+          <wp:anchor distT="0" distB="0" distL="0" distR="0" simplePos="0" relativeHeight="3" behindDoc="0" locked="0" layoutInCell="0" allowOverlap="1">
             <wp:simplePos x="0" y="0"/>
             <wp:positionH relativeFrom="page">
               <wp:posOffset>885825</wp:posOffset>
@@ -423,7 +402,6 @@
           </wp:anchor>
         </w:drawing>
       </w:r>
-      <w:bookmarkEnd w:id="1"/>
       <w:r>
         <w:rPr/>
         <w:t>Hardware</w:t>
@@ -665,6 +643,7 @@
           <w:ilvl w:val="0"/>
           <w:numId w:val="0"/>
         </w:numPr>
+        <w:ind w:hanging="0" w:start="0"/>
         <w:outlineLvl w:val="1"/>
         <w:rPr/>
       </w:pPr>
@@ -1044,6 +1023,7 @@
     <w:p>
       <w:pPr>
         <w:pStyle w:val="berschrift2"/>
+        <w:spacing w:before="0" w:after="80"/>
         <w:rPr/>
       </w:pPr>
       <w:bookmarkStart w:id="10" w:name="__RefHeading___Toc522_346844924"/>
@@ -1198,6 +1178,7 @@
           <w:ilvl w:val="0"/>
           <w:numId w:val="1"/>
         </w:numPr>
+        <w:spacing w:before="0" w:after="80"/>
         <w:rPr/>
       </w:pPr>
       <w:bookmarkStart w:id="12" w:name="__RefHeading___Toc516_346844924"/>
@@ -1233,7 +1214,7 @@
           <w:lang w:val="en-US"/>
         </w:rPr>
         <w:drawing>
-          <wp:anchor behindDoc="0" distT="0" distB="0" distL="0" distR="0" simplePos="0" locked="0" layoutInCell="0" allowOverlap="1" relativeHeight="4">
+          <wp:anchor distT="0" distB="0" distL="0" distR="0" simplePos="0" relativeHeight="4" behindDoc="0" locked="0" layoutInCell="0" allowOverlap="1">
             <wp:simplePos x="0" y="0"/>
             <wp:positionH relativeFrom="column">
               <wp:posOffset>360680</wp:posOffset>
@@ -1517,11 +1498,7 @@
             </w:pPr>
             <w:r>
               <w:rPr/>
-              <w:t xml:space="preserve">GND </w:t>
-            </w:r>
-            <w:r>
-              <w:rPr/>
-              <w:t>(-)</w:t>
+              <w:t>GND (-)</w:t>
             </w:r>
           </w:p>
         </w:tc>
@@ -1676,19 +1653,7 @@
             </w:pPr>
             <w:r>
               <w:rPr/>
-              <w:t>3,3V (</w:t>
-            </w:r>
-            <w:r>
-              <w:rPr/>
-              <w:t xml:space="preserve">Pin </w:t>
-            </w:r>
-            <w:r>
-              <w:rPr/>
-              <w:t>1</w:t>
-            </w:r>
-            <w:r>
-              <w:rPr/>
-              <w:t>)</w:t>
+              <w:t>3,3V (Pin 1)</w:t>
             </w:r>
           </w:p>
         </w:tc>
@@ -1725,7 +1690,7 @@
       </w:pPr>
       <w:r>
         <w:rPr>
-          <w:lang w:val="de-DE"/>
+          <w:lang w:val="en-US"/>
         </w:rPr>
       </w:r>
     </w:p>
@@ -1738,7 +1703,7 @@
       </w:pPr>
       <w:r>
         <w:rPr>
-          <w:lang w:val="de-DE"/>
+          <w:lang w:val="en-US"/>
         </w:rPr>
       </w:r>
     </w:p>
@@ -1751,7 +1716,7 @@
       </w:pPr>
       <w:r>
         <w:rPr>
-          <w:lang w:val="de-DE"/>
+          <w:lang w:val="en-US"/>
         </w:rPr>
       </w:r>
     </w:p>
@@ -1787,6 +1752,107 @@
         </w:rPr>
         <w:t>Der nächste Schritt ist die Installation der Adafruit Bibliothek für DHT Sensoren um das Auslesen des DHT 22 zu gewährleisten.</w:t>
       </w:r>
+    </w:p>
+    <w:p>
+      <w:pPr>
+        <w:pStyle w:val="Heading1"/>
+        <w:numPr>
+          <w:ilvl w:val="0"/>
+          <w:numId w:val="1"/>
+        </w:numPr>
+        <w:ind w:hanging="0" w:start="0"/>
+        <w:rPr/>
+      </w:pPr>
+      <w:r>
+        <w:rPr/>
+        <w:t>Software</w:t>
+      </w:r>
+    </w:p>
+    <w:p>
+      <w:pPr>
+        <w:pStyle w:val="Heading2"/>
+        <w:numPr>
+          <w:ilvl w:val="1"/>
+          <w:numId w:val="1"/>
+        </w:numPr>
+        <w:ind w:hanging="0" w:start="0"/>
+        <w:rPr/>
+      </w:pPr>
+      <w:r>
+        <w:rPr/>
+        <w:t>Web Server installieren</w:t>
+      </w:r>
+    </w:p>
+    <w:p>
+      <w:pPr>
+        <w:pStyle w:val="BodyText"/>
+        <w:rPr/>
+      </w:pPr>
+      <w:r>
+        <w:rPr/>
+        <w:t>Per SSH auf den Raspberry Pi Zero verbinden. Danach muss folgender Befehl ausgeführt werden</w:t>
+      </w:r>
+    </w:p>
+    <w:p>
+      <w:pPr>
+        <w:pStyle w:val="Code"/>
+        <w:rPr/>
+      </w:pPr>
+      <w:r>
+        <w:rPr>
+          <w:rStyle w:val="SourceText"/>
+        </w:rPr>
+        <w:t>sudo apt-get install apache2</w:t>
+      </w:r>
+    </w:p>
+    <w:p>
+      <w:pPr>
+        <w:pStyle w:val="BodyText"/>
+        <w:widowControl/>
+        <w:suppressAutoHyphens w:val="true"/>
+        <w:bidi w:val="0"/>
+        <w:spacing w:lineRule="auto" w:line="276"/>
+        <w:jc w:val="start"/>
+        <w:rPr/>
+      </w:pPr>
+      <w:r>
+        <w:rPr>
+          <w:rStyle w:val="SourceText"/>
+          <w:rFonts w:eastAsia="Arial" w:cs="Arial"/>
+          <w:color w:val="auto"/>
+          <w:kern w:val="2"/>
+          <w:sz w:val="24"/>
+          <w:szCs w:val="24"/>
+          <w:lang w:val="de-DE" w:eastAsia="en-US" w:bidi="ar-SA"/>
+        </w:rPr>
+        <w:t>Danach ist der Web Server und „</w:t>
+      </w:r>
+      <w:hyperlink r:id="rId5">
+        <w:r>
+          <w:rPr>
+            <w:rStyle w:val="Hyperlink"/>
+            <w:rFonts w:eastAsia="Arial" w:cs="Arial" w:ascii="Liberation Mono" w:hAnsi="Liberation Mono"/>
+            <w:color w:val="auto"/>
+            <w:kern w:val="2"/>
+            <w:sz w:val="24"/>
+            <w:szCs w:val="24"/>
+            <w:lang w:val="de-DE" w:eastAsia="en-US" w:bidi="ar-SA"/>
+          </w:rPr>
+          <w:t>http://IP_RASPBERRY</w:t>
+        </w:r>
+      </w:hyperlink>
+      <w:r>
+        <w:rPr>
+          <w:rStyle w:val="SourceText"/>
+          <w:rFonts w:eastAsia="Arial" w:cs="Arial"/>
+          <w:color w:val="auto"/>
+          <w:kern w:val="2"/>
+          <w:sz w:val="24"/>
+          <w:szCs w:val="24"/>
+          <w:lang w:val="de-DE" w:eastAsia="en-US" w:bidi="ar-SA"/>
+        </w:rPr>
+        <w:t>“ erreichbar.</w:t>
+      </w:r>
       <w:r>
         <w:br w:type="page"/>
       </w:r>
@@ -1798,11 +1864,12 @@
           <w:ilvl w:val="0"/>
           <w:numId w:val="1"/>
         </w:numPr>
+        <w:spacing w:before="0" w:after="80"/>
         <w:rPr/>
       </w:pPr>
       <w:bookmarkStart w:id="13" w:name="__RefHeading___Toc510_346844924"/>
-      <w:bookmarkStart w:id="14" w:name="_Toc220924526"/>
-      <w:bookmarkStart w:id="15" w:name="_Toc196762887"/>
+      <w:bookmarkStart w:id="14" w:name="_Toc196762887"/>
+      <w:bookmarkStart w:id="15" w:name="_Toc220924526"/>
       <w:bookmarkEnd w:id="13"/>
       <w:r>
         <w:rPr/>
@@ -1820,62 +1887,150 @@
         </w:tabs>
         <w:rPr/>
       </w:pPr>
+      <w:r>
+        <w:fldChar w:fldCharType="begin"/>
+      </w:r>
+      <w:r>
+        <w:rPr>
+          <w:vanish/>
+        </w:rPr>
+      </w:r>
+      <w:r>
+        <w:rPr>
+          <w:vanish/>
+        </w:rPr>
+      </w:r>
       <w:hyperlink w:anchor="_Toc177567445" w:tgtFrame="_top">
         <w:r>
           <w:rPr>
-            <w:webHidden/>
+            <w:rStyle w:val="Hyperlink"/>
+            <w:vanish/>
           </w:rPr>
           <w:fldChar w:fldCharType="begin"/>
         </w:r>
-        <w:r>
-          <w:rPr>
-            <w:webHidden/>
-          </w:rPr>
-          <w:instrText xml:space="preserve">PAGEREF _Toc177567445 \h</w:instrText>
-        </w:r>
-        <w:r>
-          <w:rPr>
-            <w:webHidden/>
-          </w:rPr>
-          <w:fldChar w:fldCharType="separate"/>
-        </w:r>
-        <w:r>
-          <w:rPr>
-            <w:rStyle w:val="Hyperlink"/>
-          </w:rPr>
-          <w:fldChar w:fldCharType="begin"/>
-        </w:r>
-        <w:r>
-          <w:rPr>
-            <w:webHidden/>
-          </w:rPr>
-          <w:fldChar w:fldCharType="end"/>
-        </w:r>
-        <w:r>
-          <w:rPr>
-            <w:rStyle w:val="Hyperlink"/>
-          </w:rPr>
-          <w:instrText xml:space="preserve"> PAGEREF _Toc177567445 \h </w:instrText>
-        </w:r>
-        <w:r>
-          <w:rPr>
-            <w:rStyle w:val="Hyperlink"/>
-          </w:rPr>
-          <w:fldChar w:fldCharType="separate"/>
-        </w:r>
-        <w:r>
-          <w:rPr>
-            <w:rStyle w:val="Hyperlink"/>
-          </w:rPr>
-          <w:t>Error: Reference source not found</w:t>
-        </w:r>
-        <w:r>
-          <w:rPr>
-            <w:rStyle w:val="Hyperlink"/>
-          </w:rPr>
-          <w:fldChar w:fldCharType="end"/>
-        </w:r>
       </w:hyperlink>
+      <w:r>
+        <w:rPr>
+          <w:rStyle w:val="Hyperlink"/>
+          <w:vanish/>
+        </w:rPr>
+      </w:r>
+      <w:r>
+        <w:rPr>
+          <w:rStyle w:val="Hyperlink"/>
+          <w:vanish/>
+        </w:rPr>
+        <w:instrText xml:space="preserve"> PAGEREF _Toc177567445 \h </w:instrText>
+      </w:r>
+      <w:r>
+        <w:rPr>
+          <w:rStyle w:val="Hyperlink"/>
+          <w:vanish/>
+        </w:rPr>
+        <w:fldChar w:fldCharType="separate"/>
+      </w:r>
+      <w:r>
+        <w:rPr>
+          <w:rStyle w:val="Hyperlink"/>
+          <w:vanish/>
+        </w:rPr>
+        <w:t>Error: Reference source not found</w:t>
+      </w:r>
+      <w:r>
+        <w:rPr>
+          <w:rStyle w:val="Hyperlink"/>
+          <w:vanish/>
+        </w:rPr>
+        <w:fldChar w:fldCharType="end"/>
+      </w:r>
+      <w:r>
+        <w:rPr>
+          <w:rStyle w:val="Hyperlink"/>
+          <w:vanish/>
+        </w:rPr>
+        <w:fldChar w:fldCharType="separate"/>
+      </w:r>
+      <w:r>
+        <w:rPr>
+          <w:rStyle w:val="Hyperlink"/>
+          <w:vanish/>
+        </w:rPr>
+      </w:r>
+      <w:r>
+        <w:rPr>
+          <w:rStyle w:val="Hyperlink"/>
+          <w:vanish/>
+        </w:rPr>
+      </w:r>
+      <w:r>
+        <w:rPr>
+          <w:rStyle w:val="Hyperlink"/>
+          <w:vanish/>
+        </w:rPr>
+        <w:fldChar w:fldCharType="end"/>
+      </w:r>
+      <w:r>
+        <w:rPr>
+          <w:rStyle w:val="Hyperlink"/>
+          <w:vanish/>
+        </w:rPr>
+        <w:fldChar w:fldCharType="begin"/>
+      </w:r>
+      <w:r>
+        <w:rPr>
+          <w:rStyle w:val="Hyperlink"/>
+          <w:vanish/>
+        </w:rPr>
+        <w:instrText xml:space="preserve"> PAGEREF _Toc177567445 \h </w:instrText>
+      </w:r>
+      <w:r>
+        <w:rPr>
+          <w:rStyle w:val="Hyperlink"/>
+          <w:vanish/>
+        </w:rPr>
+        <w:fldChar w:fldCharType="separate"/>
+      </w:r>
+      <w:r>
+        <w:rPr>
+          <w:rStyle w:val="Hyperlink"/>
+          <w:vanish/>
+        </w:rPr>
+        <w:t>Error: Reference source not found</w:t>
+      </w:r>
+      <w:r>
+        <w:rPr>
+          <w:rStyle w:val="Hyperlink"/>
+          <w:vanish/>
+        </w:rPr>
+        <w:fldChar w:fldCharType="end"/>
+      </w:r>
+      <w:r>
+        <w:rPr>
+          <w:rStyle w:val="Hyperlink"/>
+          <w:vanish/>
+        </w:rPr>
+        <w:fldChar w:fldCharType="separate"/>
+      </w:r>
+      <w:r>
+        <w:rPr>
+          <w:rStyle w:val="Hyperlink"/>
+          <w:vanish/>
+        </w:rPr>
+      </w:r>
+      <w:r/>
+      <w:r>
+        <w:rPr>
+          <w:rStyle w:val="Hyperlink"/>
+          <w:vanish/>
+        </w:rPr>
+        <w:fldChar w:fldCharType="end"/>
+      </w:r>
+      <w:r>
+        <w:rPr>
+          <w:rStyle w:val="Hyperlink"/>
+          <w:vanish/>
+        </w:rPr>
+      </w:r>
     </w:p>
     <w:p>
       <w:pPr>
@@ -1896,8 +2051,8 @@
         <w:rPr/>
       </w:pPr>
       <w:bookmarkStart w:id="16" w:name="__RefHeading___Toc508_346844924"/>
-      <w:bookmarkStart w:id="17" w:name="_Toc220924527"/>
-      <w:bookmarkStart w:id="18" w:name="_Toc196762888"/>
+      <w:bookmarkStart w:id="17" w:name="_Toc196762888"/>
+      <w:bookmarkStart w:id="18" w:name="_Toc220924527"/>
       <w:bookmarkEnd w:id="16"/>
       <w:r>
         <w:rPr/>
@@ -1930,12 +2085,12 @@
       </w:r>
     </w:p>
     <w:sectPr>
-      <w:headerReference w:type="even" r:id="rId5"/>
-      <w:headerReference w:type="default" r:id="rId6"/>
-      <w:headerReference w:type="first" r:id="rId7"/>
-      <w:footerReference w:type="even" r:id="rId8"/>
-      <w:footerReference w:type="default" r:id="rId9"/>
-      <w:footerReference w:type="first" r:id="rId10"/>
+      <w:headerReference w:type="even" r:id="rId6"/>
+      <w:headerReference w:type="default" r:id="rId7"/>
+      <w:headerReference w:type="first" r:id="rId8"/>
+      <w:footerReference w:type="even" r:id="rId9"/>
+      <w:footerReference w:type="default" r:id="rId10"/>
+      <w:footerReference w:type="first" r:id="rId11"/>
       <w:type w:val="nextPage"/>
       <w:pgSz w:w="11906" w:h="16838"/>
       <w:pgMar w:left="1417" w:right="1417" w:gutter="0" w:header="708" w:top="1417" w:footer="708" w:bottom="1134"/>
@@ -1954,7 +2109,6 @@
   <w:p>
     <w:pPr>
       <w:pStyle w:val="Footer"/>
-      <w:suppressLineNumbers/>
       <w:spacing w:before="0" w:after="160"/>
       <w:rPr/>
     </w:pPr>
@@ -2015,7 +2169,7 @@
     </w:r>
     <w:r>
       <w:rPr/>
-      <w:t>09.02.2026</w:t>
+      <w:t>09.03.2026</w:t>
     </w:r>
     <w:r>
       <w:rPr/>
@@ -2046,7 +2200,6 @@
   <w:p>
     <w:pPr>
       <w:pStyle w:val="Header"/>
-      <w:suppressLineNumbers/>
       <w:spacing w:before="0" w:after="160"/>
       <w:rPr/>
     </w:pPr>
@@ -3606,6 +3759,13 @@
       <w:rFonts w:ascii="Wingdings" w:hAnsi="Wingdings"/>
     </w:rPr>
   </w:style>
+  <w:style w:type="character" w:styleId="SourceText">
+    <w:name w:val="Source Text"/>
+    <w:qFormat/>
+    <w:rPr>
+      <w:rFonts w:ascii="Liberation Mono" w:hAnsi="Liberation Mono" w:eastAsia="Liberation Mono" w:cs="Liberation Mono"/>
+    </w:rPr>
+  </w:style>
   <w:style w:type="paragraph" w:styleId="Heading" w:customStyle="1">
     <w:name w:val="Heading"/>
     <w:basedOn w:val="Normal"/>
@@ -3859,8 +4019,8 @@
     <w:pPr/>
     <w:rPr/>
   </w:style>
-  <w:style w:type="paragraph" w:styleId="FrameContentsuser" w:customStyle="1">
-    <w:name w:val="Frame Contents (user)"/>
+  <w:style w:type="paragraph" w:styleId="FrameContents" w:customStyle="1">
+    <w:name w:val="Frame Contents"/>
     <w:basedOn w:val="Normal"/>
     <w:qFormat/>
     <w:pPr/>
@@ -3879,6 +4039,7 @@
       </w:pBdr>
     </w:pPr>
     <w:rPr>
+      <w:rFonts w:ascii="Liberation Mono" w:hAnsi="Liberation Mono"/>
       <w:i/>
       <w:lang w:val="en-US"/>
     </w:rPr>

</xml_diff>

<commit_message>
change Folder Structure + updated backend scripts
</commit_message>
<xml_diff>
--- a/Dokumentation/Protokoll.docx
+++ b/Dokumentation/Protokoll.docx
@@ -69,7 +69,7 @@
       </w:r>
       <w:r>
         <w:rPr/>
-        <w:t>18. März 2026</w:t>
+        <w:t>23. März 2026</w:t>
       </w:r>
       <w:r>
         <w:rPr/>
@@ -588,7 +588,7 @@
         <w:pStyle w:val="berschrift1"/>
         <w:numPr>
           <w:ilvl w:val="0"/>
-          <w:numId w:val="1"/>
+          <w:numId w:val="2"/>
         </w:numPr>
         <w:spacing w:before="0" w:after="80"/>
         <w:rPr/>
@@ -655,7 +655,7 @@
         <w:pStyle w:val="berschrift2"/>
         <w:numPr>
           <w:ilvl w:val="1"/>
-          <w:numId w:val="1"/>
+          <w:numId w:val="2"/>
         </w:numPr>
         <w:rPr/>
       </w:pPr>
@@ -667,86 +667,6 @@
         <w:t>Raspberry Pi Setup</w:t>
       </w:r>
       <w:bookmarkEnd w:id="3"/>
-    </w:p>
-    <w:p>
-      <w:pPr>
-        <w:pStyle w:val="ListParagraph"/>
-        <w:numPr>
-          <w:ilvl w:val="0"/>
-          <w:numId w:val="2"/>
-        </w:numPr>
-        <w:rPr/>
-      </w:pPr>
-      <w:r>
-        <w:rPr/>
-        <w:t>Raspberry Pi Zero 2W</w:t>
-      </w:r>
-    </w:p>
-    <w:p>
-      <w:pPr>
-        <w:pStyle w:val="ListParagraph"/>
-        <w:numPr>
-          <w:ilvl w:val="0"/>
-          <w:numId w:val="2"/>
-        </w:numPr>
-        <w:rPr/>
-      </w:pPr>
-      <w:r>
-        <w:rPr/>
-        <w:t>Micro USB Cabel</w:t>
-      </w:r>
-    </w:p>
-    <w:p>
-      <w:pPr>
-        <w:pStyle w:val="ListParagraph"/>
-        <w:numPr>
-          <w:ilvl w:val="0"/>
-          <w:numId w:val="2"/>
-        </w:numPr>
-        <w:rPr/>
-      </w:pPr>
-      <w:r>
-        <w:rPr/>
-        <w:t>Micro-SD mit min. 32GB Speicher</w:t>
-      </w:r>
-    </w:p>
-    <w:p>
-      <w:pPr>
-        <w:pStyle w:val="ListParagraph"/>
-        <w:numPr>
-          <w:ilvl w:val="0"/>
-          <w:numId w:val="2"/>
-        </w:numPr>
-        <w:rPr/>
-      </w:pPr>
-      <w:r>
-        <w:rPr/>
-        <w:t xml:space="preserve">PC/Laptop mit Micro-SD Kompatibilität </w:t>
-      </w:r>
-    </w:p>
-    <w:p>
-      <w:pPr>
-        <w:pStyle w:val="ListParagraph"/>
-        <w:numPr>
-          <w:ilvl w:val="0"/>
-          <w:numId w:val="2"/>
-        </w:numPr>
-        <w:rPr/>
-      </w:pPr>
-      <w:r>
-        <w:rPr/>
-        <w:t>Raspberry Pi Imager</w:t>
-      </w:r>
-    </w:p>
-    <w:p>
-      <w:pPr>
-        <w:pStyle w:val="Normal"/>
-        <w:rPr/>
-      </w:pPr>
-      <w:r>
-        <w:rPr/>
-        <w:t>Ablauf:</w:t>
-      </w:r>
     </w:p>
     <w:p>
       <w:pPr>
@@ -759,7 +679,7 @@
       </w:pPr>
       <w:r>
         <w:rPr/>
-        <w:t>Mit Raspberry Pi Imager, Raspberry OS Lite, auf Micro-SD laden</w:t>
+        <w:t>Raspberry Pi Zero 2W</w:t>
       </w:r>
     </w:p>
     <w:p>
@@ -773,8 +693,7 @@
       </w:pPr>
       <w:r>
         <w:rPr/>
-        <w:tab/>
-        <w:t>SSH aktivieren</w:t>
+        <w:t>Micro USB Cabel</w:t>
       </w:r>
     </w:p>
     <w:p>
@@ -788,8 +707,7 @@
       </w:pPr>
       <w:r>
         <w:rPr/>
-        <w:tab/>
-        <w:t>WLAN aktivieren</w:t>
+        <w:t>Micro-SD mit min. 32GB Speicher</w:t>
       </w:r>
     </w:p>
     <w:p>
@@ -803,7 +721,7 @@
       </w:pPr>
       <w:r>
         <w:rPr/>
-        <w:t>Raspberry Pi Zero 2W an Strom hängen, Micro-SD reinstecken</w:t>
+        <w:t xml:space="preserve">PC/Laptop mit Micro-SD Kompatibilität </w:t>
       </w:r>
     </w:p>
     <w:p>
@@ -817,7 +735,17 @@
       </w:pPr>
       <w:r>
         <w:rPr/>
-        <w:t>Mit PC über Power Shell auf Raspberry verbinden</w:t>
+        <w:t>Raspberry Pi Imager</w:t>
+      </w:r>
+    </w:p>
+    <w:p>
+      <w:pPr>
+        <w:pStyle w:val="Normal"/>
+        <w:rPr/>
+      </w:pPr>
+      <w:r>
+        <w:rPr/>
+        <w:t>Ablauf:</w:t>
       </w:r>
     </w:p>
     <w:p>
@@ -825,7 +753,79 @@
         <w:pStyle w:val="ListParagraph"/>
         <w:numPr>
           <w:ilvl w:val="0"/>
-          <w:numId w:val="3"/>
+          <w:numId w:val="4"/>
+        </w:numPr>
+        <w:rPr/>
+      </w:pPr>
+      <w:r>
+        <w:rPr/>
+        <w:t>Mit Raspberry Pi Imager, Raspberry OS Lite, auf Micro-SD laden</w:t>
+      </w:r>
+    </w:p>
+    <w:p>
+      <w:pPr>
+        <w:pStyle w:val="ListParagraph"/>
+        <w:numPr>
+          <w:ilvl w:val="0"/>
+          <w:numId w:val="4"/>
+        </w:numPr>
+        <w:rPr/>
+      </w:pPr>
+      <w:r>
+        <w:rPr/>
+        <w:tab/>
+        <w:t>SSH aktivieren</w:t>
+      </w:r>
+    </w:p>
+    <w:p>
+      <w:pPr>
+        <w:pStyle w:val="ListParagraph"/>
+        <w:numPr>
+          <w:ilvl w:val="0"/>
+          <w:numId w:val="4"/>
+        </w:numPr>
+        <w:rPr/>
+      </w:pPr>
+      <w:r>
+        <w:rPr/>
+        <w:tab/>
+        <w:t>WLAN aktivieren</w:t>
+      </w:r>
+    </w:p>
+    <w:p>
+      <w:pPr>
+        <w:pStyle w:val="ListParagraph"/>
+        <w:numPr>
+          <w:ilvl w:val="0"/>
+          <w:numId w:val="4"/>
+        </w:numPr>
+        <w:rPr/>
+      </w:pPr>
+      <w:r>
+        <w:rPr/>
+        <w:t>Raspberry Pi Zero 2W an Strom hängen, Micro-SD reinstecken</w:t>
+      </w:r>
+    </w:p>
+    <w:p>
+      <w:pPr>
+        <w:pStyle w:val="ListParagraph"/>
+        <w:numPr>
+          <w:ilvl w:val="0"/>
+          <w:numId w:val="4"/>
+        </w:numPr>
+        <w:rPr/>
+      </w:pPr>
+      <w:r>
+        <w:rPr/>
+        <w:t>Mit PC über Power Shell auf Raspberry verbinden</w:t>
+      </w:r>
+    </w:p>
+    <w:p>
+      <w:pPr>
+        <w:pStyle w:val="ListParagraph"/>
+        <w:numPr>
+          <w:ilvl w:val="0"/>
+          <w:numId w:val="4"/>
         </w:numPr>
         <w:rPr/>
       </w:pPr>
@@ -1419,7 +1419,7 @@
         <w:pStyle w:val="berschrift2"/>
         <w:numPr>
           <w:ilvl w:val="0"/>
-          <w:numId w:val="1"/>
+          <w:numId w:val="2"/>
         </w:numPr>
         <w:spacing w:before="0" w:after="80"/>
         <w:rPr/>
@@ -1543,7 +1543,7 @@
         <w:pStyle w:val="Heading3"/>
         <w:numPr>
           <w:ilvl w:val="2"/>
-          <w:numId w:val="1"/>
+          <w:numId w:val="2"/>
         </w:numPr>
         <w:ind w:hanging="0" w:start="0"/>
         <w:rPr/>
@@ -2003,7 +2003,7 @@
         <w:pStyle w:val="Heading1"/>
         <w:numPr>
           <w:ilvl w:val="0"/>
-          <w:numId w:val="1"/>
+          <w:numId w:val="2"/>
         </w:numPr>
         <w:ind w:hanging="0" w:start="0"/>
         <w:rPr/>
@@ -2020,7 +2020,7 @@
         <w:pStyle w:val="Heading2"/>
         <w:numPr>
           <w:ilvl w:val="1"/>
-          <w:numId w:val="1"/>
+          <w:numId w:val="2"/>
         </w:numPr>
         <w:ind w:hanging="0" w:start="0"/>
         <w:rPr/>
@@ -2030,6 +2030,15 @@
       <w:r>
         <w:rPr/>
         <w:t>Ordnerstruktur am Raspberry</w:t>
+      </w:r>
+    </w:p>
+    <w:p>
+      <w:pPr>
+        <w:pStyle w:val="BodyText"/>
+        <w:rPr/>
+      </w:pPr>
+      <w:r>
+        <w:rPr/>
       </w:r>
     </w:p>
     <w:p>
@@ -2046,7 +2055,7 @@
         <w:pStyle w:val="Heading2"/>
         <w:numPr>
           <w:ilvl w:val="1"/>
-          <w:numId w:val="1"/>
+          <w:numId w:val="2"/>
         </w:numPr>
         <w:ind w:hanging="0" w:start="0"/>
         <w:rPr/>
@@ -2083,17 +2092,12 @@
     <w:p>
       <w:pPr>
         <w:pStyle w:val="BodyText"/>
-        <w:widowControl/>
-        <w:suppressAutoHyphens w:val="true"/>
-        <w:bidi w:val="0"/>
-        <w:spacing w:lineRule="auto" w:line="276"/>
-        <w:jc w:val="start"/>
         <w:rPr/>
       </w:pPr>
       <w:r>
         <w:rPr>
           <w:rStyle w:val="SourceText"/>
-          <w:rFonts w:eastAsia="Arial" w:cs="Arial"/>
+          <w:rFonts w:eastAsia="Arial" w:cs="Arial" w:ascii="Arial" w:hAnsi="Arial"/>
           <w:color w:val="auto"/>
           <w:kern w:val="2"/>
           <w:sz w:val="24"/>
@@ -2106,7 +2110,7 @@
         <w:r>
           <w:rPr>
             <w:rStyle w:val="Hyperlink"/>
-            <w:rFonts w:eastAsia="Arial" w:cs="Arial" w:ascii="Liberation Mono" w:hAnsi="Liberation Mono"/>
+            <w:rFonts w:eastAsia="Arial" w:cs="Arial" w:ascii="Arial" w:hAnsi="Arial"/>
             <w:color w:val="auto"/>
             <w:kern w:val="2"/>
             <w:sz w:val="24"/>
@@ -2119,7 +2123,7 @@
       <w:r>
         <w:rPr>
           <w:rStyle w:val="SourceText"/>
-          <w:rFonts w:eastAsia="Arial" w:cs="Arial"/>
+          <w:rFonts w:eastAsia="Arial" w:cs="Arial" w:ascii="Arial" w:hAnsi="Arial"/>
           <w:color w:val="auto"/>
           <w:kern w:val="2"/>
           <w:sz w:val="24"/>
@@ -2132,20 +2136,107 @@
     <w:p>
       <w:pPr>
         <w:pStyle w:val="BodyText"/>
-        <w:widowControl/>
-        <w:suppressAutoHyphens w:val="true"/>
-        <w:bidi w:val="0"/>
-        <w:spacing w:lineRule="auto" w:line="276"/>
-        <w:jc w:val="start"/>
+        <w:rPr/>
+      </w:pPr>
+      <w:r>
         <w:rPr>
           <w:rStyle w:val="SourceText"/>
-          <w:rFonts w:eastAsia="Arial" w:cs="Arial"/>
+          <w:rFonts w:eastAsia="Arial" w:cs="Arial" w:ascii="Arial" w:hAnsi="Arial"/>
           <w:color w:val="auto"/>
           <w:kern w:val="2"/>
           <w:sz w:val="24"/>
           <w:szCs w:val="24"/>
           <w:lang w:val="de-DE" w:eastAsia="en-US" w:bidi="ar-SA"/>
         </w:rPr>
+        <w:t>Danach muss in der „</w:t>
+      </w:r>
+      <w:r>
+        <w:rPr>
+          <w:rStyle w:val="SourceText"/>
+          <w:rFonts w:eastAsia="Arial" w:cs="Arial" w:ascii="Arial" w:hAnsi="Arial"/>
+          <w:color w:val="auto"/>
+          <w:kern w:val="2"/>
+          <w:sz w:val="24"/>
+          <w:szCs w:val="24"/>
+          <w:lang w:val="de-DE" w:eastAsia="en-US" w:bidi="ar-SA"/>
+        </w:rPr>
+        <w:t>000-default.conf</w:t>
+      </w:r>
+      <w:r>
+        <w:rPr>
+          <w:rStyle w:val="SourceText"/>
+          <w:rFonts w:eastAsia="Arial" w:cs="Arial" w:ascii="Arial" w:hAnsi="Arial"/>
+          <w:color w:val="auto"/>
+          <w:kern w:val="2"/>
+          <w:sz w:val="24"/>
+          <w:szCs w:val="24"/>
+          <w:lang w:val="de-DE" w:eastAsia="en-US" w:bidi="ar-SA"/>
+        </w:rPr>
+        <w:t>“ Datei, die in „/etc/apache2/sites-enabled/“ liegt, der Standardpfad von „/var/www/html“ auf „/home/admin/Wetterstation/frontend/dist“ geändert werden.</w:t>
+      </w:r>
+    </w:p>
+    <w:p>
+      <w:pPr>
+        <w:pStyle w:val="Heading2"/>
+        <w:numPr>
+          <w:ilvl w:val="1"/>
+          <w:numId w:val="2"/>
+        </w:numPr>
+        <w:ind w:hanging="0" w:start="0"/>
+        <w:rPr/>
+      </w:pPr>
+      <w:r>
+        <w:rPr>
+          <w:rStyle w:val="SourceText"/>
+          <w:rFonts w:ascii="Arial" w:hAnsi="Arial"/>
+        </w:rPr>
+        <w:t>Autostart mit Deamon</w:t>
+      </w:r>
+    </w:p>
+    <w:p>
+      <w:pPr>
+        <w:pStyle w:val="BodyText"/>
+        <w:rPr/>
+      </w:pPr>
+      <w:r>
+        <w:rPr>
+          <w:rStyle w:val="SourceText"/>
+          <w:rFonts w:ascii="Arial" w:hAnsi="Arial"/>
+        </w:rPr>
+        <w:t>Als etrstes muss eine Service Datei erstellt werden.</w:t>
+      </w:r>
+    </w:p>
+    <w:p>
+      <w:pPr>
+        <w:pStyle w:val="Code"/>
+        <w:rPr/>
+      </w:pPr>
+      <w:r>
+        <w:rPr>
+          <w:rStyle w:val="SourceText"/>
+        </w:rPr>
+        <w:t>sudo nano /etc/systemd/system/wetterstation.service</w:t>
+      </w:r>
+    </w:p>
+    <w:p>
+      <w:pPr>
+        <w:pStyle w:val="BodyText"/>
+        <w:rPr>
+          <w:rStyle w:val="SourceText"/>
+          <w:rFonts w:ascii="Arial" w:hAnsi="Arial"/>
+        </w:rPr>
+      </w:pPr>
+      <w:r>
+        <w:rPr/>
+      </w:r>
+    </w:p>
+    <w:p>
+      <w:pPr>
+        <w:pStyle w:val="BodyText"/>
+        <w:rPr>
+          <w:rStyle w:val="SourceText"/>
+          <w:rFonts w:ascii="Arial" w:hAnsi="Arial"/>
+        </w:rPr>
       </w:pPr>
       <w:r>
         <w:rPr/>
@@ -2159,14 +2250,14 @@
         <w:pStyle w:val="berschrift1"/>
         <w:numPr>
           <w:ilvl w:val="0"/>
-          <w:numId w:val="1"/>
+          <w:numId w:val="2"/>
         </w:numPr>
         <w:spacing w:before="0" w:after="80"/>
         <w:rPr/>
       </w:pPr>
       <w:bookmarkStart w:id="17" w:name="__RefHeading___Toc510_346844924"/>
-      <w:bookmarkStart w:id="18" w:name="_Toc220924526"/>
-      <w:bookmarkStart w:id="19" w:name="_Toc196762887"/>
+      <w:bookmarkStart w:id="18" w:name="_Toc196762887"/>
+      <w:bookmarkStart w:id="19" w:name="_Toc220924526"/>
       <w:bookmarkEnd w:id="17"/>
       <w:r>
         <w:rPr/>
@@ -2188,55 +2279,57 @@
         <w:fldChar w:fldCharType="begin"/>
       </w:r>
       <w:r>
-        <w:rPr/>
-      </w:r>
-      <w:r>
-        <w:rPr/>
-      </w:r>
-      <w:r>
-        <w:fldChar w:fldCharType="begin"/>
-      </w:r>
-      <w:r>
         <w:rPr>
           <w:rStyle w:val="Hyperlink"/>
+          <w:vanish/>
         </w:rPr>
       </w:r>
       <w:hyperlink w:anchor="_Toc177567445" w:tgtFrame="_top">
         <w:r>
           <w:rPr>
-            <w:rStyle w:val="Hyperlink"/>
+            <w:webHidden/>
           </w:rPr>
+          <w:fldChar w:fldCharType="begin"/>
         </w:r>
         <w:r>
           <w:rPr>
-            <w:rStyle w:val="Hyperlink"/>
+            <w:webHidden/>
+          </w:rPr>
+          <w:instrText xml:space="preserve">PAGEREF _Toc177567445 \h</w:instrText>
+        </w:r>
+        <w:r>
+          <w:rPr>
+            <w:webHidden/>
           </w:rPr>
           <w:fldChar w:fldCharType="separate"/>
         </w:r>
         <w:r>
           <w:rPr>
             <w:rStyle w:val="Hyperlink"/>
+            <w:vanish/>
           </w:rPr>
         </w:r>
         <w:r>
           <w:rPr>
-            <w:rStyle w:val="Hyperlink"/>
-          </w:rPr>
-        </w:r>
-        <w:r>
-          <w:rPr>
-            <w:rStyle w:val="Hyperlink"/>
+            <w:webHidden/>
           </w:rPr>
           <w:fldChar w:fldCharType="end"/>
         </w:r>
-        <w:r>
-          <w:rPr>
-            <w:rStyle w:val="Hyperlink"/>
-            <w:vanish/>
-          </w:rPr>
-          <w:t xml:space="preserve"> PAGEREF _Toc177567445 \h Error: Reference source not found</w:t>
-        </w:r>
       </w:hyperlink>
+      <w:r>
+        <w:rPr>
+          <w:rStyle w:val="Hyperlink"/>
+          <w:vanish/>
+        </w:rPr>
+        <w:fldChar w:fldCharType="begin"/>
+      </w:r>
+      <w:r>
+        <w:rPr>
+          <w:rStyle w:val="Hyperlink"/>
+          <w:vanish/>
+        </w:rPr>
+        <w:instrText xml:space="preserve"> PAGEREF _Toc177567445 \h </w:instrText>
+      </w:r>
       <w:r>
         <w:rPr>
           <w:rStyle w:val="Hyperlink"/>
@@ -2249,12 +2342,7 @@
           <w:rStyle w:val="Hyperlink"/>
           <w:vanish/>
         </w:rPr>
-      </w:r>
-      <w:r>
-        <w:rPr>
-          <w:rStyle w:val="Hyperlink"/>
-          <w:vanish/>
-        </w:rPr>
+        <w:t>Error: Reference source not found</w:t>
       </w:r>
       <w:r>
         <w:rPr>
@@ -2268,6 +2356,32 @@
           <w:rStyle w:val="Hyperlink"/>
           <w:vanish/>
         </w:rPr>
+        <w:fldChar w:fldCharType="separate"/>
+      </w:r>
+      <w:r>
+        <w:rPr>
+          <w:rStyle w:val="Hyperlink"/>
+          <w:vanish/>
+        </w:rPr>
+      </w:r>
+      <w:r>
+        <w:rPr>
+          <w:rStyle w:val="Hyperlink"/>
+          <w:vanish/>
+        </w:rPr>
+      </w:r>
+      <w:r>
+        <w:rPr>
+          <w:rStyle w:val="Hyperlink"/>
+          <w:vanish/>
+        </w:rPr>
+        <w:fldChar w:fldCharType="end"/>
+      </w:r>
+      <w:r>
+        <w:rPr>
+          <w:rStyle w:val="Hyperlink"/>
+          <w:vanish/>
+        </w:rPr>
         <w:fldChar w:fldCharType="begin"/>
       </w:r>
       <w:r>
@@ -2313,13 +2427,13 @@
         <w:pStyle w:val="berschrift1"/>
         <w:numPr>
           <w:ilvl w:val="0"/>
-          <w:numId w:val="1"/>
+          <w:numId w:val="2"/>
         </w:numPr>
         <w:rPr/>
       </w:pPr>
       <w:bookmarkStart w:id="20" w:name="__RefHeading___Toc508_346844924"/>
-      <w:bookmarkStart w:id="21" w:name="_Toc220924527"/>
-      <w:bookmarkStart w:id="22" w:name="_Toc196762888"/>
+      <w:bookmarkStart w:id="21" w:name="_Toc196762888"/>
+      <w:bookmarkStart w:id="22" w:name="_Toc220924527"/>
       <w:bookmarkEnd w:id="20"/>
       <w:r>
         <w:rPr/>
@@ -2436,7 +2550,7 @@
     </w:r>
     <w:r>
       <w:rPr/>
-      <w:t>18.03.2026</w:t>
+      <w:t>23.03.2026</w:t>
     </w:r>
     <w:r>
       <w:rPr/>
@@ -2545,6 +2659,125 @@
       <w:start w:val="1"/>
       <w:numFmt w:val="none"/>
       <w:suff w:val="nothing"/>
+      <w:lvlText w:val=""/>
+      <w:lvlJc w:val="start"/>
+      <w:pPr>
+        <w:tabs>
+          <w:tab w:val="num" w:pos="0"/>
+        </w:tabs>
+        <w:ind w:start="0" w:hanging="0"/>
+      </w:pPr>
+    </w:lvl>
+    <w:lvl w:ilvl="1">
+      <w:start w:val="1"/>
+      <w:numFmt w:val="none"/>
+      <w:suff w:val="nothing"/>
+      <w:lvlText w:val=""/>
+      <w:lvlJc w:val="start"/>
+      <w:pPr>
+        <w:tabs>
+          <w:tab w:val="num" w:pos="0"/>
+        </w:tabs>
+        <w:ind w:start="0" w:hanging="0"/>
+      </w:pPr>
+    </w:lvl>
+    <w:lvl w:ilvl="2">
+      <w:start w:val="1"/>
+      <w:numFmt w:val="none"/>
+      <w:suff w:val="nothing"/>
+      <w:lvlText w:val=""/>
+      <w:lvlJc w:val="start"/>
+      <w:pPr>
+        <w:tabs>
+          <w:tab w:val="num" w:pos="0"/>
+        </w:tabs>
+        <w:ind w:start="0" w:hanging="0"/>
+      </w:pPr>
+    </w:lvl>
+    <w:lvl w:ilvl="3">
+      <w:start w:val="1"/>
+      <w:numFmt w:val="none"/>
+      <w:suff w:val="nothing"/>
+      <w:lvlText w:val=""/>
+      <w:lvlJc w:val="start"/>
+      <w:pPr>
+        <w:tabs>
+          <w:tab w:val="num" w:pos="0"/>
+        </w:tabs>
+        <w:ind w:start="0" w:hanging="0"/>
+      </w:pPr>
+    </w:lvl>
+    <w:lvl w:ilvl="4">
+      <w:start w:val="1"/>
+      <w:numFmt w:val="none"/>
+      <w:suff w:val="nothing"/>
+      <w:lvlText w:val=""/>
+      <w:lvlJc w:val="start"/>
+      <w:pPr>
+        <w:tabs>
+          <w:tab w:val="num" w:pos="0"/>
+        </w:tabs>
+        <w:ind w:start="0" w:hanging="0"/>
+      </w:pPr>
+    </w:lvl>
+    <w:lvl w:ilvl="5">
+      <w:start w:val="1"/>
+      <w:numFmt w:val="none"/>
+      <w:suff w:val="nothing"/>
+      <w:lvlText w:val=""/>
+      <w:lvlJc w:val="start"/>
+      <w:pPr>
+        <w:tabs>
+          <w:tab w:val="num" w:pos="0"/>
+        </w:tabs>
+        <w:ind w:start="0" w:hanging="0"/>
+      </w:pPr>
+    </w:lvl>
+    <w:lvl w:ilvl="6">
+      <w:start w:val="1"/>
+      <w:numFmt w:val="none"/>
+      <w:suff w:val="nothing"/>
+      <w:lvlText w:val=""/>
+      <w:lvlJc w:val="start"/>
+      <w:pPr>
+        <w:tabs>
+          <w:tab w:val="num" w:pos="0"/>
+        </w:tabs>
+        <w:ind w:start="0" w:hanging="0"/>
+      </w:pPr>
+    </w:lvl>
+    <w:lvl w:ilvl="7">
+      <w:start w:val="1"/>
+      <w:numFmt w:val="none"/>
+      <w:suff w:val="nothing"/>
+      <w:lvlText w:val=""/>
+      <w:lvlJc w:val="start"/>
+      <w:pPr>
+        <w:tabs>
+          <w:tab w:val="num" w:pos="0"/>
+        </w:tabs>
+        <w:ind w:start="0" w:hanging="0"/>
+      </w:pPr>
+    </w:lvl>
+    <w:lvl w:ilvl="8">
+      <w:start w:val="1"/>
+      <w:numFmt w:val="none"/>
+      <w:suff w:val="nothing"/>
+      <w:lvlText w:val=""/>
+      <w:lvlJc w:val="start"/>
+      <w:pPr>
+        <w:tabs>
+          <w:tab w:val="num" w:pos="0"/>
+        </w:tabs>
+        <w:ind w:start="0" w:hanging="0"/>
+      </w:pPr>
+    </w:lvl>
+  </w:abstractNum>
+  <w:abstractNum w:abstractNumId="2">
+    <w:lvl w:ilvl="0">
+      <w:start w:val="1"/>
+      <w:numFmt w:val="none"/>
+      <w:suff w:val="nothing"/>
       <w:lvlText w:val="%1"/>
       <w:lvlJc w:val="start"/>
       <w:pPr>
@@ -2668,7 +2901,7 @@
       <w:rPr/>
     </w:lvl>
   </w:abstractNum>
-  <w:abstractNum w:abstractNumId="2">
+  <w:abstractNum w:abstractNumId="3">
     <w:lvl w:ilvl="0">
       <w:start w:val="1"/>
       <w:numFmt w:val="bullet"/>
@@ -2805,7 +3038,7 @@
       </w:rPr>
     </w:lvl>
   </w:abstractNum>
-  <w:abstractNum w:abstractNumId="3">
+  <w:abstractNum w:abstractNumId="4">
     <w:lvl w:ilvl="0">
       <w:start w:val="1"/>
       <w:numFmt w:val="bullet"/>
@@ -2940,125 +3173,6 @@
       <w:rPr>
         <w:rFonts w:ascii="Wingdings" w:hAnsi="Wingdings" w:cs="Wingdings" w:hint="default"/>
       </w:rPr>
-    </w:lvl>
-  </w:abstractNum>
-  <w:abstractNum w:abstractNumId="4">
-    <w:lvl w:ilvl="0">
-      <w:start w:val="1"/>
-      <w:numFmt w:val="none"/>
-      <w:suff w:val="nothing"/>
-      <w:lvlText w:val=""/>
-      <w:lvlJc w:val="start"/>
-      <w:pPr>
-        <w:tabs>
-          <w:tab w:val="num" w:pos="0"/>
-        </w:tabs>
-        <w:ind w:start="0" w:hanging="0"/>
-      </w:pPr>
-    </w:lvl>
-    <w:lvl w:ilvl="1">
-      <w:start w:val="1"/>
-      <w:numFmt w:val="none"/>
-      <w:suff w:val="nothing"/>
-      <w:lvlText w:val=""/>
-      <w:lvlJc w:val="start"/>
-      <w:pPr>
-        <w:tabs>
-          <w:tab w:val="num" w:pos="0"/>
-        </w:tabs>
-        <w:ind w:start="0" w:hanging="0"/>
-      </w:pPr>
-    </w:lvl>
-    <w:lvl w:ilvl="2">
-      <w:start w:val="1"/>
-      <w:numFmt w:val="none"/>
-      <w:suff w:val="nothing"/>
-      <w:lvlText w:val=""/>
-      <w:lvlJc w:val="start"/>
-      <w:pPr>
-        <w:tabs>
-          <w:tab w:val="num" w:pos="0"/>
-        </w:tabs>
-        <w:ind w:start="0" w:hanging="0"/>
-      </w:pPr>
-    </w:lvl>
-    <w:lvl w:ilvl="3">
-      <w:start w:val="1"/>
-      <w:numFmt w:val="none"/>
-      <w:suff w:val="nothing"/>
-      <w:lvlText w:val=""/>
-      <w:lvlJc w:val="start"/>
-      <w:pPr>
-        <w:tabs>
-          <w:tab w:val="num" w:pos="0"/>
-        </w:tabs>
-        <w:ind w:start="0" w:hanging="0"/>
-      </w:pPr>
-    </w:lvl>
-    <w:lvl w:ilvl="4">
-      <w:start w:val="1"/>
-      <w:numFmt w:val="none"/>
-      <w:suff w:val="nothing"/>
-      <w:lvlText w:val=""/>
-      <w:lvlJc w:val="start"/>
-      <w:pPr>
-        <w:tabs>
-          <w:tab w:val="num" w:pos="0"/>
-        </w:tabs>
-        <w:ind w:start="0" w:hanging="0"/>
-      </w:pPr>
-    </w:lvl>
-    <w:lvl w:ilvl="5">
-      <w:start w:val="1"/>
-      <w:numFmt w:val="none"/>
-      <w:suff w:val="nothing"/>
-      <w:lvlText w:val=""/>
-      <w:lvlJc w:val="start"/>
-      <w:pPr>
-        <w:tabs>
-          <w:tab w:val="num" w:pos="0"/>
-        </w:tabs>
-        <w:ind w:start="0" w:hanging="0"/>
-      </w:pPr>
-    </w:lvl>
-    <w:lvl w:ilvl="6">
-      <w:start w:val="1"/>
-      <w:numFmt w:val="none"/>
-      <w:suff w:val="nothing"/>
-      <w:lvlText w:val=""/>
-      <w:lvlJc w:val="start"/>
-      <w:pPr>
-        <w:tabs>
-          <w:tab w:val="num" w:pos="0"/>
-        </w:tabs>
-        <w:ind w:start="0" w:hanging="0"/>
-      </w:pPr>
-    </w:lvl>
-    <w:lvl w:ilvl="7">
-      <w:start w:val="1"/>
-      <w:numFmt w:val="none"/>
-      <w:suff w:val="nothing"/>
-      <w:lvlText w:val=""/>
-      <w:lvlJc w:val="start"/>
-      <w:pPr>
-        <w:tabs>
-          <w:tab w:val="num" w:pos="0"/>
-        </w:tabs>
-        <w:ind w:start="0" w:hanging="0"/>
-      </w:pPr>
-    </w:lvl>
-    <w:lvl w:ilvl="8">
-      <w:start w:val="1"/>
-      <w:numFmt w:val="none"/>
-      <w:suff w:val="nothing"/>
-      <w:lvlText w:val=""/>
-      <w:lvlJc w:val="start"/>
-      <w:pPr>
-        <w:tabs>
-          <w:tab w:val="num" w:pos="0"/>
-        </w:tabs>
-        <w:ind w:start="0" w:hanging="0"/>
-      </w:pPr>
     </w:lvl>
   </w:abstractNum>
   <w:num w:numId="1">
@@ -3501,7 +3615,7 @@
       <w:keepLines/>
       <w:numPr>
         <w:ilvl w:val="0"/>
-        <w:numId w:val="1"/>
+        <w:numId w:val="2"/>
       </w:numPr>
       <w:spacing w:before="360" w:after="80"/>
       <w:outlineLvl w:val="0"/>
@@ -3524,7 +3638,7 @@
       <w:keepLines/>
       <w:numPr>
         <w:ilvl w:val="1"/>
-        <w:numId w:val="1"/>
+        <w:numId w:val="2"/>
       </w:numPr>
       <w:spacing w:before="160" w:after="80"/>
       <w:outlineLvl w:val="1"/>
@@ -3549,7 +3663,7 @@
       <w:keepLines/>
       <w:numPr>
         <w:ilvl w:val="2"/>
-        <w:numId w:val="1"/>
+        <w:numId w:val="2"/>
       </w:numPr>
       <w:spacing w:before="160" w:after="80"/>
       <w:outlineLvl w:val="2"/>
@@ -3574,7 +3688,7 @@
       <w:keepLines/>
       <w:numPr>
         <w:ilvl w:val="3"/>
-        <w:numId w:val="1"/>
+        <w:numId w:val="2"/>
       </w:numPr>
       <w:spacing w:before="80" w:after="40"/>
       <w:outlineLvl w:val="3"/>
@@ -3599,7 +3713,7 @@
       <w:keepLines/>
       <w:numPr>
         <w:ilvl w:val="4"/>
-        <w:numId w:val="1"/>
+        <w:numId w:val="2"/>
       </w:numPr>
       <w:spacing w:before="80" w:after="40"/>
       <w:outlineLvl w:val="4"/>
@@ -3622,7 +3736,7 @@
       <w:keepLines/>
       <w:numPr>
         <w:ilvl w:val="5"/>
-        <w:numId w:val="1"/>
+        <w:numId w:val="2"/>
       </w:numPr>
       <w:spacing w:before="40" w:after="0"/>
       <w:outlineLvl w:val="5"/>
@@ -3644,7 +3758,7 @@
       <w:keepLines/>
       <w:numPr>
         <w:ilvl w:val="6"/>
-        <w:numId w:val="1"/>
+        <w:numId w:val="2"/>
       </w:numPr>
       <w:spacing w:before="40" w:after="0"/>
       <w:outlineLvl w:val="6"/>
@@ -3664,7 +3778,7 @@
       <w:keepLines/>
       <w:numPr>
         <w:ilvl w:val="7"/>
-        <w:numId w:val="1"/>
+        <w:numId w:val="2"/>
       </w:numPr>
       <w:spacing w:before="0" w:after="0"/>
       <w:outlineLvl w:val="7"/>
@@ -3686,7 +3800,7 @@
       <w:keepLines/>
       <w:numPr>
         <w:ilvl w:val="8"/>
-        <w:numId w:val="1"/>
+        <w:numId w:val="2"/>
       </w:numPr>
       <w:spacing w:before="0" w:after="0"/>
       <w:outlineLvl w:val="8"/>
@@ -4286,8 +4400,8 @@
     <w:pPr/>
     <w:rPr/>
   </w:style>
-  <w:style w:type="paragraph" w:styleId="FrameContentsuser" w:customStyle="1">
-    <w:name w:val="Frame Contents (user)"/>
+  <w:style w:type="paragraph" w:styleId="FrameContents" w:customStyle="1">
+    <w:name w:val="Frame Contents"/>
     <w:basedOn w:val="Normal"/>
     <w:qFormat/>
     <w:pPr/>

</xml_diff>